<commit_message>
Push updated outputs, template profiles, and app state files
- Regenerated Responder Tracking DOCX for 14 conditions (rebuilt from scratch, no template dependency)
- Updated stroke_rehab partners documents (6Network_Bedside, Clinical_Exam_Checklist, Clinical_Handbook)
- Add data/template_profiles/ — 40 template profile JSON configs for Streamlit app
- Add outputs/promotion_proposals/, resolutions/, revision_history/ — app-generated JSON state files

Co-Authored-By: Claude Sonnet 4.6 <noreply@anthropic.com>
</commit_message>
<xml_diff>
--- a/outputs/documents/stroke_rehab/partners/Clinical_Handbook_Partners_stroke_rehab.docx
+++ b/outputs/documents/stroke_rehab/partners/Clinical_Handbook_Partners_stroke_rehab.docx
@@ -11257,7 +11257,7 @@
                 <w:sz w:val="24"/>
                 <w:szCs w:val="24"/>
               </w:rPr>
-              <w:t>Regulatory</w:t>
+              <w:t>Classification</w:t>
             </w:r>
           </w:p>
         </w:tc>
@@ -11296,7 +11296,7 @@
                 <w:sz w:val="24"/>
                 <w:szCs w:val="24"/>
               </w:rPr>
-              <w:t>Evidence Level</w:t>
+              <w:t>Stroke Rehab Status</w:t>
             </w:r>
           </w:p>
         </w:tc>
@@ -11478,7 +11478,7 @@
                 <w:sz w:val="24"/>
                 <w:szCs w:val="24"/>
               </w:rPr>
-              <w:t>RCT, Meta-analysis</w:t>
+              <w:t>Level A/B evidence — established NIBS for motor rehabilitation</w:t>
             </w:r>
           </w:p>
         </w:tc>
@@ -11588,7 +11588,7 @@
                 <w:sz w:val="24"/>
                 <w:szCs w:val="24"/>
               </w:rPr>
-              <w:t>CE Class IIa — INVESTIGATIONAL OFF-LABEL</w:t>
+              <w:t>CE Class IIa</w:t>
             </w:r>
           </w:p>
         </w:tc>
@@ -11624,7 +11624,7 @@
                 <w:sz w:val="24"/>
                 <w:szCs w:val="24"/>
               </w:rPr>
-              <w:t>Investigational</w:t>
+              <w:t>INVESTIGATIONAL (Off-Label)</w:t>
             </w:r>
           </w:p>
         </w:tc>
@@ -11736,7 +11736,7 @@
                 <w:sz w:val="24"/>
                 <w:szCs w:val="24"/>
               </w:rPr>
-              <w:t>CE-marked (epilepsy/depression)</w:t>
+              <w:t>CE-marked</w:t>
             </w:r>
           </w:p>
         </w:tc>
@@ -11772,7 +11772,7 @@
                 <w:sz w:val="24"/>
                 <w:szCs w:val="24"/>
               </w:rPr>
-              <w:t>RCT, Open-label</w:t>
+              <w:t>Emerging — paired with language therapy (aphasia); motor rehab adjunct</w:t>
             </w:r>
           </w:p>
         </w:tc>
@@ -11882,7 +11882,7 @@
                 <w:sz w:val="24"/>
                 <w:szCs w:val="24"/>
               </w:rPr>
-              <w:t>FDA-cleared (anxiety/insomnia/depression)</w:t>
+              <w:t>FDA-cleared</w:t>
             </w:r>
           </w:p>
         </w:tc>
@@ -11918,7 +11918,7 @@
                 <w:sz w:val="24"/>
                 <w:szCs w:val="24"/>
               </w:rPr>
-              <w:t>Open-label, Pilot</w:t>
+              <w:t>Investigational (Off-Label) — fatigue, depression, sleep component</w:t>
             </w:r>
           </w:p>
         </w:tc>

</xml_diff>